<commit_message>
Ofícios - Editar Ajustado e Assinatura P/ SEDE
</commit_message>
<xml_diff>
--- a/public/Barco_Modelo_Oficio_Placeholders.docx
+++ b/public/Barco_Modelo_Oficio_Placeholders.docx
@@ -423,28 +423,23 @@
       <w:pPr>
         <w:jc w:val="both"/>
       </w:pPr>
-    </w:p>
-    <w:p>
-      <w:pPr>
-        <w:jc w:val="both"/>
-      </w:pPr>
       <w:r>
         <w:rPr>
           <w:noProof/>
         </w:rPr>
         <w:drawing>
-          <wp:anchor distT="0" distB="0" distL="114300" distR="114300" simplePos="0" relativeHeight="251660288" behindDoc="1" locked="0" layoutInCell="1" allowOverlap="1" wp14:anchorId="03940BF5" wp14:editId="297B8BA7">
+          <wp:anchor distT="0" distB="0" distL="114300" distR="114300" simplePos="0" relativeHeight="251659264" behindDoc="1" locked="0" layoutInCell="1" allowOverlap="1" wp14:anchorId="38A19820" wp14:editId="118EB9CF">
             <wp:simplePos x="0" y="0"/>
             <wp:positionH relativeFrom="column">
-              <wp:posOffset>234950</wp:posOffset>
+              <wp:posOffset>387350</wp:posOffset>
             </wp:positionH>
             <wp:positionV relativeFrom="paragraph">
-              <wp:posOffset>27305</wp:posOffset>
+              <wp:posOffset>137160</wp:posOffset>
             </wp:positionV>
-            <wp:extent cx="1914525" cy="971103"/>
-            <wp:effectExtent l="0" t="0" r="0" b="0"/>
+            <wp:extent cx="1292225" cy="1241425"/>
+            <wp:effectExtent l="0" t="0" r="3175" b="0"/>
             <wp:wrapNone/>
-            <wp:docPr id="6" name="Imagem 1" descr="Texto, Carta&#10;&#10;Descrição gerada automaticamente"/>
+            <wp:docPr id="1108191157" name="Imagem 1" descr="Desenho com traços pretos em fundo branco&#10;&#10;Descrição gerada automaticamente com confiança média"/>
             <wp:cNvGraphicFramePr>
               <a:graphicFrameLocks xmlns:a="http://schemas.openxmlformats.org/drawingml/2006/main" noChangeAspect="1"/>
             </wp:cNvGraphicFramePr>
@@ -452,19 +447,17 @@
               <a:graphicData uri="http://schemas.openxmlformats.org/drawingml/2006/picture">
                 <pic:pic xmlns:pic="http://schemas.openxmlformats.org/drawingml/2006/picture">
                   <pic:nvPicPr>
-                    <pic:cNvPr id="6" name="Imagem 6" descr="Texto, Carta&#10;&#10;Descrição gerada automaticamente"/>
-                    <pic:cNvPicPr>
-                      <a:picLocks noChangeAspect="1"/>
-                    </pic:cNvPicPr>
+                    <pic:cNvPr id="1108191157" name="Imagem 1" descr="Desenho com traços pretos em fundo branco&#10;&#10;Descrição gerada automaticamente com confiança média"/>
+                    <pic:cNvPicPr/>
                   </pic:nvPicPr>
                   <pic:blipFill>
                     <a:blip r:embed="rId10" cstate="print">
                       <a:clrChange>
                         <a:clrFrom>
-                          <a:srgbClr val="FFFFFF"/>
+                          <a:srgbClr val="FCFEFD"/>
                         </a:clrFrom>
                         <a:clrTo>
-                          <a:srgbClr val="FFFFFF">
+                          <a:srgbClr val="FCFEFD">
                             <a:alpha val="0"/>
                           </a:srgbClr>
                         </a:clrTo>
@@ -475,20 +468,18 @@
                         </a:ext>
                       </a:extLst>
                     </a:blip>
-                    <a:srcRect/>
                     <a:stretch>
                       <a:fillRect/>
                     </a:stretch>
                   </pic:blipFill>
-                  <pic:spPr bwMode="auto">
+                  <pic:spPr>
                     <a:xfrm>
                       <a:off x="0" y="0"/>
-                      <a:ext cx="1914525" cy="971103"/>
+                      <a:ext cx="1292225" cy="1241425"/>
                     </a:xfrm>
                     <a:prstGeom prst="rect">
                       <a:avLst/>
                     </a:prstGeom>
-                    <a:noFill/>
                   </pic:spPr>
                 </pic:pic>
               </a:graphicData>
@@ -502,6 +493,11 @@
           </wp:anchor>
         </w:drawing>
       </w:r>
+    </w:p>
+    <w:p>
+      <w:pPr>
+        <w:jc w:val="both"/>
+      </w:pPr>
     </w:p>
     <w:p>
       <w:pPr>
@@ -3862,18 +3858,18 @@
 </file>
 
 <file path=customXml/item1.xml><?xml version="1.0" encoding="utf-8"?>
-<p:properties xmlns:p="http://schemas.microsoft.com/office/2006/metadata/properties" xmlns:xsi="http://www.w3.org/2001/XMLSchema-instance" xmlns:pc="http://schemas.microsoft.com/office/infopath/2007/PartnerControls">
-  <documentManagement/>
-</p:properties>
-</file>
-
-<file path=customXml/item2.xml><?xml version="1.0" encoding="utf-8"?>
 <?mso-contentType ?>
 <FormTemplates xmlns="http://schemas.microsoft.com/sharepoint/v3/contenttype/forms">
   <Display>DocumentLibraryForm</Display>
   <Edit>DocumentLibraryForm</Edit>
   <New>DocumentLibraryForm</New>
 </FormTemplates>
+</file>
+
+<file path=customXml/item2.xml><?xml version="1.0" encoding="utf-8"?>
+<p:properties xmlns:p="http://schemas.microsoft.com/office/2006/metadata/properties" xmlns:xsi="http://www.w3.org/2001/XMLSchema-instance" xmlns:pc="http://schemas.microsoft.com/office/infopath/2007/PartnerControls">
+  <documentManagement/>
+</p:properties>
 </file>
 
 <file path=customXml/item3.xml><?xml version="1.0" encoding="utf-8"?>
@@ -4015,18 +4011,18 @@
 </file>
 
 <file path=customXml/itemProps1.xml><?xml version="1.0" encoding="utf-8"?>
-<ds:datastoreItem xmlns:ds="http://schemas.openxmlformats.org/officeDocument/2006/customXml" ds:itemID="{3A9EA4BE-E3B6-49A8-A8A7-D32E618C1B96}">
+<ds:datastoreItem xmlns:ds="http://schemas.openxmlformats.org/officeDocument/2006/customXml" ds:itemID="{15487310-0DAD-4EC5-8B46-2B5D03BA84E1}">
   <ds:schemaRefs>
-    <ds:schemaRef ds:uri="http://schemas.microsoft.com/office/2006/metadata/properties"/>
-    <ds:schemaRef ds:uri="http://schemas.microsoft.com/office/infopath/2007/PartnerControls"/>
+    <ds:schemaRef ds:uri="http://schemas.microsoft.com/sharepoint/v3/contenttype/forms"/>
   </ds:schemaRefs>
 </ds:datastoreItem>
 </file>
 
 <file path=customXml/itemProps2.xml><?xml version="1.0" encoding="utf-8"?>
-<ds:datastoreItem xmlns:ds="http://schemas.openxmlformats.org/officeDocument/2006/customXml" ds:itemID="{15487310-0DAD-4EC5-8B46-2B5D03BA84E1}">
+<ds:datastoreItem xmlns:ds="http://schemas.openxmlformats.org/officeDocument/2006/customXml" ds:itemID="{3A9EA4BE-E3B6-49A8-A8A7-D32E618C1B96}">
   <ds:schemaRefs>
-    <ds:schemaRef ds:uri="http://schemas.microsoft.com/sharepoint/v3/contenttype/forms"/>
+    <ds:schemaRef ds:uri="http://schemas.microsoft.com/office/2006/metadata/properties"/>
+    <ds:schemaRef ds:uri="http://schemas.microsoft.com/office/infopath/2007/PartnerControls"/>
   </ds:schemaRefs>
 </ds:datastoreItem>
 </file>

</xml_diff>